<commit_message>
fix [quiz - g7]
</commit_message>
<xml_diff>
--- a/7-G-7/9-week-9/5-Quiz/Computer Quiz G7 N1.docx
+++ b/7-G-7/9-week-9/5-Quiz/Computer Quiz G7 N1.docx
@@ -4,7 +4,7 @@
   <w:body>
     <w:tbl>
       <w:tblPr>
-        <w:tblStyle w:val="TableGrid"/>
+        <w:tblStyle w:val="a6"/>
         <w:tblpPr w:leftFromText="180" w:rightFromText="180" w:vertAnchor="text" w:horzAnchor="margin" w:tblpY="565"/>
         <w:tblW w:w="0" w:type="auto"/>
         <w:tblBorders>
@@ -282,7 +282,7 @@
         <w:bidi w:val="0"/>
         <w:jc w:val="center"/>
         <w:rPr>
-          <w:rFonts w:ascii="Lucida Bright" w:hAnsi="Lucida Bright" w:hint="cs"/>
+          <w:rFonts w:ascii="Lucida Bright" w:hAnsi="Lucida Bright"/>
           <w:b/>
           <w:bCs/>
           <w:sz w:val="36"/>
@@ -307,29 +307,7 @@
           <w:sz w:val="36"/>
           <w:szCs w:val="36"/>
         </w:rPr>
-        <w:t xml:space="preserve"> No. </w:t>
-      </w:r>
-      <w:proofErr w:type="gramStart"/>
-      <w:r>
-        <w:rPr>
-          <w:rFonts w:ascii="Lucida Bright" w:hAnsi="Lucida Bright"/>
-          <w:b/>
-          <w:bCs/>
-          <w:sz w:val="36"/>
-          <w:szCs w:val="36"/>
-        </w:rPr>
-        <w:t xml:space="preserve">(  </w:t>
-      </w:r>
-      <w:proofErr w:type="gramEnd"/>
-      <w:r>
-        <w:rPr>
-          <w:rFonts w:ascii="Lucida Bright" w:hAnsi="Lucida Bright"/>
-          <w:b/>
-          <w:bCs/>
-          <w:sz w:val="36"/>
-          <w:szCs w:val="36"/>
-        </w:rPr>
-        <w:t xml:space="preserve">  </w:t>
+        <w:t xml:space="preserve"> No. (    </w:t>
       </w:r>
       <w:r>
         <w:rPr>
@@ -349,21 +327,74 @@
           <w:sz w:val="36"/>
           <w:szCs w:val="36"/>
         </w:rPr>
-        <w:t xml:space="preserve"> </w:t>
+        <w:t xml:space="preserve">   )</w:t>
       </w:r>
-      <w:proofErr w:type="gramStart"/>
-      <w:r>
-        <w:rPr>
-          <w:rFonts w:ascii="Lucida Bright" w:hAnsi="Lucida Bright"/>
-          <w:b/>
-          <w:bCs/>
-          <w:sz w:val="36"/>
-          <w:szCs w:val="36"/>
-        </w:rPr>
-        <w:t xml:space="preserve">  )</w:t>
-      </w:r>
-      <w:proofErr w:type="gramEnd"/>
     </w:p>
+    <w:tbl>
+      <w:tblPr>
+        <w:tblStyle w:val="a6"/>
+        <w:tblpPr w:leftFromText="180" w:rightFromText="180" w:vertAnchor="text" w:horzAnchor="margin" w:tblpXSpec="right" w:tblpY="1488"/>
+        <w:tblW w:w="0" w:type="auto"/>
+        <w:tblLook w:val="04A0" w:firstRow="1" w:lastRow="0" w:firstColumn="1" w:lastColumn="0" w:noHBand="0" w:noVBand="1"/>
+      </w:tblPr>
+      <w:tblGrid>
+        <w:gridCol w:w="1486"/>
+      </w:tblGrid>
+      <w:tr>
+        <w:trPr>
+          <w:trHeight w:val="480"/>
+        </w:trPr>
+        <w:tc>
+          <w:tcPr>
+            <w:tcW w:w="1486" w:type="dxa"/>
+          </w:tcPr>
+          <w:p>
+            <w:pPr>
+              <w:jc w:val="center"/>
+              <w:rPr>
+                <w:rFonts w:ascii="Arial Black" w:hAnsi="Arial Black"/>
+                <w:b/>
+                <w:bCs/>
+                <w:sz w:val="34"/>
+                <w:szCs w:val="34"/>
+              </w:rPr>
+            </w:pPr>
+          </w:p>
+        </w:tc>
+      </w:tr>
+      <w:tr>
+        <w:trPr>
+          <w:trHeight w:val="465"/>
+        </w:trPr>
+        <w:tc>
+          <w:tcPr>
+            <w:tcW w:w="1486" w:type="dxa"/>
+          </w:tcPr>
+          <w:p>
+            <w:pPr>
+              <w:jc w:val="center"/>
+              <w:rPr>
+                <w:rFonts w:ascii="Arial Black" w:hAnsi="Arial Black"/>
+                <w:b/>
+                <w:bCs/>
+                <w:sz w:val="34"/>
+                <w:szCs w:val="34"/>
+              </w:rPr>
+            </w:pPr>
+            <w:r>
+              <w:rPr>
+                <w:rFonts w:ascii="Arial Black" w:hAnsi="Arial Black"/>
+                <w:b/>
+                <w:bCs/>
+                <w:sz w:val="34"/>
+                <w:szCs w:val="34"/>
+              </w:rPr>
+              <w:t>7.5</w:t>
+            </w:r>
+          </w:p>
+        </w:tc>
+      </w:tr>
+    </w:tbl>
     <w:p>
       <w:pPr>
         <w:bidi w:val="0"/>
@@ -397,8 +428,6 @@
       <w:r>
         <w:rPr>
           <w:rFonts w:ascii="Arial Black" w:hAnsi="Arial Black"/>
-          <w:b/>
-          <w:bCs/>
           <w:sz w:val="36"/>
           <w:szCs w:val="36"/>
         </w:rPr>
@@ -407,13 +436,23 @@
       <w:r>
         <w:rPr>
           <w:rFonts w:ascii="Arial Black" w:hAnsi="Arial Black"/>
-          <w:b/>
-          <w:bCs/>
           <w:sz w:val="34"/>
           <w:szCs w:val="34"/>
         </w:rPr>
         <w:t>choose whether the below statements are True or False.</w:t>
       </w:r>
+    </w:p>
+    <w:p>
+      <w:pPr>
+        <w:bidi w:val="0"/>
+        <w:rPr>
+          <w:rFonts w:ascii="Arial Black" w:hAnsi="Arial Black"/>
+          <w:b/>
+          <w:bCs/>
+          <w:sz w:val="34"/>
+          <w:szCs w:val="34"/>
+        </w:rPr>
+      </w:pPr>
     </w:p>
     <w:p>
       <w:pPr>
@@ -594,49 +633,74 @@
           <w:sz w:val="32"/>
           <w:szCs w:val="32"/>
         </w:rPr>
-        <w:t xml:space="preserve">Plane geometry deals with flat shapes like lines, </w:t>
-      </w:r>
-      <w:proofErr w:type="gramStart"/>
-      <w:r>
-        <w:rPr>
-          <w:b/>
-          <w:bCs/>
-          <w:sz w:val="32"/>
-          <w:szCs w:val="32"/>
-        </w:rPr>
-        <w:t>curve</w:t>
-      </w:r>
-      <w:proofErr w:type="gramEnd"/>
-      <w:r>
-        <w:rPr>
-          <w:b/>
-          <w:bCs/>
-          <w:sz w:val="32"/>
-          <w:szCs w:val="32"/>
-        </w:rPr>
-        <w:t xml:space="preserve">, polygons </w:t>
-      </w:r>
-      <w:proofErr w:type="spellStart"/>
-      <w:r>
-        <w:rPr>
-          <w:b/>
-          <w:bCs/>
-          <w:sz w:val="32"/>
-          <w:szCs w:val="32"/>
-        </w:rPr>
-        <w:t>etc</w:t>
-      </w:r>
-      <w:proofErr w:type="spellEnd"/>
-      <w:r>
-        <w:rPr>
-          <w:b/>
-          <w:bCs/>
-          <w:sz w:val="32"/>
-          <w:szCs w:val="32"/>
-        </w:rPr>
-        <w:t>, that can be drawn on a piece of paper.</w:t>
+        <w:t>Plane geometry deals with flat shapes like lines, curve, polygons etc, that can be drawn on a piece of paper.</w:t>
       </w:r>
     </w:p>
+    <w:tbl>
+      <w:tblPr>
+        <w:tblStyle w:val="a6"/>
+        <w:tblpPr w:leftFromText="180" w:rightFromText="180" w:vertAnchor="text" w:horzAnchor="margin" w:tblpXSpec="right" w:tblpY="859"/>
+        <w:tblW w:w="0" w:type="auto"/>
+        <w:tblLook w:val="04A0" w:firstRow="1" w:lastRow="0" w:firstColumn="1" w:lastColumn="0" w:noHBand="0" w:noVBand="1"/>
+      </w:tblPr>
+      <w:tblGrid>
+        <w:gridCol w:w="1486"/>
+      </w:tblGrid>
+      <w:tr>
+        <w:trPr>
+          <w:trHeight w:val="480"/>
+        </w:trPr>
+        <w:tc>
+          <w:tcPr>
+            <w:tcW w:w="1486" w:type="dxa"/>
+          </w:tcPr>
+          <w:p>
+            <w:pPr>
+              <w:jc w:val="center"/>
+              <w:rPr>
+                <w:rFonts w:ascii="Arial Black" w:hAnsi="Arial Black"/>
+                <w:b/>
+                <w:bCs/>
+                <w:sz w:val="34"/>
+                <w:szCs w:val="34"/>
+              </w:rPr>
+            </w:pPr>
+          </w:p>
+        </w:tc>
+      </w:tr>
+      <w:tr>
+        <w:trPr>
+          <w:trHeight w:val="465"/>
+        </w:trPr>
+        <w:tc>
+          <w:tcPr>
+            <w:tcW w:w="1486" w:type="dxa"/>
+          </w:tcPr>
+          <w:p>
+            <w:pPr>
+              <w:jc w:val="center"/>
+              <w:rPr>
+                <w:rFonts w:ascii="Arial Black" w:hAnsi="Arial Black"/>
+                <w:b/>
+                <w:bCs/>
+                <w:sz w:val="34"/>
+                <w:szCs w:val="34"/>
+              </w:rPr>
+            </w:pPr>
+            <w:r>
+              <w:rPr>
+                <w:rFonts w:ascii="Arial Black" w:hAnsi="Arial Black"/>
+                <w:b/>
+                <w:bCs/>
+                <w:sz w:val="34"/>
+                <w:szCs w:val="34"/>
+              </w:rPr>
+              <w:t>2.5</w:t>
+            </w:r>
+          </w:p>
+        </w:tc>
+      </w:tr>
+    </w:tbl>
     <w:p>
       <w:pPr>
         <w:numPr>
@@ -700,13 +764,245 @@
       </w:pPr>
       <w:r>
         <w:rPr>
+          <w:bCs/>
+          <w:noProof/>
+          <w:sz w:val="52"/>
+          <w:szCs w:val="52"/>
+          <w:rtl/>
+          <w:lang w:val="ar-SA"/>
+        </w:rPr>
+        <mc:AlternateContent>
+          <mc:Choice Requires="wps">
+            <w:drawing>
+              <wp:anchor distT="0" distB="0" distL="114300" distR="114300" simplePos="0" relativeHeight="251656704" behindDoc="0" locked="0" layoutInCell="1" allowOverlap="1" wp14:anchorId="4FA71826" wp14:editId="66C554B8">
+                <wp:simplePos x="0" y="0"/>
+                <wp:positionH relativeFrom="column">
+                  <wp:posOffset>2371725</wp:posOffset>
+                </wp:positionH>
+                <wp:positionV relativeFrom="paragraph">
+                  <wp:posOffset>40640</wp:posOffset>
+                </wp:positionV>
+                <wp:extent cx="1400175" cy="495300"/>
+                <wp:effectExtent l="0" t="0" r="28575" b="19050"/>
+                <wp:wrapNone/>
+                <wp:docPr id="559406911" name="مستطيل: زوايا مستديرة 2"/>
+                <wp:cNvGraphicFramePr/>
+                <a:graphic xmlns:a="http://schemas.openxmlformats.org/drawingml/2006/main">
+                  <a:graphicData uri="http://schemas.microsoft.com/office/word/2010/wordprocessingShape">
+                    <wps:wsp>
+                      <wps:cNvSpPr/>
+                      <wps:spPr>
+                        <a:xfrm>
+                          <a:off x="0" y="0"/>
+                          <a:ext cx="1400175" cy="495300"/>
+                        </a:xfrm>
+                        <a:prstGeom prst="roundRect">
+                          <a:avLst/>
+                        </a:prstGeom>
+                      </wps:spPr>
+                      <wps:style>
+                        <a:lnRef idx="2">
+                          <a:schemeClr val="accent1">
+                            <a:shade val="15000"/>
+                          </a:schemeClr>
+                        </a:lnRef>
+                        <a:fillRef idx="1">
+                          <a:schemeClr val="accent1"/>
+                        </a:fillRef>
+                        <a:effectRef idx="0">
+                          <a:schemeClr val="accent1"/>
+                        </a:effectRef>
+                        <a:fontRef idx="minor">
+                          <a:schemeClr val="lt1"/>
+                        </a:fontRef>
+                      </wps:style>
+                      <wps:txbx>
+                        <w:txbxContent>
+                          <w:p>
+                            <w:pPr>
+                              <w:jc w:val="center"/>
+                              <w:rPr>
+                                <w:sz w:val="48"/>
+                                <w:szCs w:val="48"/>
+                              </w:rPr>
+                            </w:pPr>
+                            <w:r>
+                              <w:rPr>
+                                <w:sz w:val="48"/>
+                                <w:szCs w:val="48"/>
+                              </w:rPr>
+                              <w:t>metric</w:t>
+                            </w:r>
+                          </w:p>
+                        </w:txbxContent>
+                      </wps:txbx>
+                      <wps:bodyPr rot="0" spcFirstLastPara="0" vertOverflow="overflow" horzOverflow="overflow" vert="horz" wrap="square" lIns="91440" tIns="45720" rIns="91440" bIns="45720" numCol="1" spcCol="0" rtlCol="0" fromWordArt="0" anchor="ctr" anchorCtr="0" forceAA="0" compatLnSpc="1">
+                        <a:prstTxWarp prst="textNoShape">
+                          <a:avLst/>
+                        </a:prstTxWarp>
+                        <a:noAutofit/>
+                      </wps:bodyPr>
+                    </wps:wsp>
+                  </a:graphicData>
+                </a:graphic>
+              </wp:anchor>
+            </w:drawing>
+          </mc:Choice>
+          <mc:Fallback>
+            <w:pict>
+              <v:roundrect w14:anchorId="4FA71826" id="مستطيل: زوايا مستديرة 2" o:spid="_x0000_s1026" style="position:absolute;margin-left:186.75pt;margin-top:3.2pt;width:110.25pt;height:39pt;z-index:251656704;visibility:visible;mso-wrap-style:square;mso-wrap-distance-left:9pt;mso-wrap-distance-top:0;mso-wrap-distance-right:9pt;mso-wrap-distance-bottom:0;mso-position-horizontal:absolute;mso-position-horizontal-relative:text;mso-position-vertical:absolute;mso-position-vertical-relative:text;v-text-anchor:middle" arcsize="10923f" o:gfxdata="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" fillcolor="#4f81bd [3204]" strokecolor="#0a121c [484]" strokeweight="2pt">
+                <v:textbox>
+                  <w:txbxContent>
+                    <w:p>
+                      <w:pPr>
+                        <w:jc w:val="center"/>
+                        <w:rPr>
+                          <w:sz w:val="48"/>
+                          <w:szCs w:val="48"/>
+                        </w:rPr>
+                      </w:pPr>
+                      <w:r>
+                        <w:rPr>
+                          <w:sz w:val="48"/>
+                          <w:szCs w:val="48"/>
+                        </w:rPr>
+                        <w:t>metric</w:t>
+                      </w:r>
+                    </w:p>
+                  </w:txbxContent>
+                </v:textbox>
+              </v:roundrect>
+            </w:pict>
+          </mc:Fallback>
+        </mc:AlternateContent>
+      </w:r>
+      <w:r>
+        <w:rPr>
+          <w:bCs/>
+          <w:noProof/>
+          <w:sz w:val="52"/>
+          <w:szCs w:val="52"/>
+          <w:rtl/>
+          <w:lang w:val="ar-SA"/>
+        </w:rPr>
+        <mc:AlternateContent>
+          <mc:Choice Requires="wps">
+            <w:drawing>
+              <wp:anchor distT="0" distB="0" distL="114300" distR="114300" simplePos="0" relativeHeight="251663872" behindDoc="0" locked="0" layoutInCell="1" allowOverlap="1" wp14:anchorId="793AB217" wp14:editId="050AB8AA">
+                <wp:simplePos x="0" y="0"/>
+                <wp:positionH relativeFrom="column">
+                  <wp:posOffset>4391025</wp:posOffset>
+                </wp:positionH>
+                <wp:positionV relativeFrom="paragraph">
+                  <wp:posOffset>59690</wp:posOffset>
+                </wp:positionV>
+                <wp:extent cx="1400175" cy="495300"/>
+                <wp:effectExtent l="0" t="0" r="28575" b="19050"/>
+                <wp:wrapNone/>
+                <wp:docPr id="1755943654" name="مستطيل: زوايا مستديرة 2"/>
+                <wp:cNvGraphicFramePr/>
+                <a:graphic xmlns:a="http://schemas.openxmlformats.org/drawingml/2006/main">
+                  <a:graphicData uri="http://schemas.microsoft.com/office/word/2010/wordprocessingShape">
+                    <wps:wsp>
+                      <wps:cNvSpPr/>
+                      <wps:spPr>
+                        <a:xfrm>
+                          <a:off x="0" y="0"/>
+                          <a:ext cx="1400175" cy="495300"/>
+                        </a:xfrm>
+                        <a:prstGeom prst="roundRect">
+                          <a:avLst/>
+                        </a:prstGeom>
+                      </wps:spPr>
+                      <wps:style>
+                        <a:lnRef idx="2">
+                          <a:schemeClr val="accent1">
+                            <a:shade val="15000"/>
+                          </a:schemeClr>
+                        </a:lnRef>
+                        <a:fillRef idx="1">
+                          <a:schemeClr val="accent1"/>
+                        </a:fillRef>
+                        <a:effectRef idx="0">
+                          <a:schemeClr val="accent1"/>
+                        </a:effectRef>
+                        <a:fontRef idx="minor">
+                          <a:schemeClr val="lt1"/>
+                        </a:fontRef>
+                      </wps:style>
+                      <wps:txbx>
+                        <w:txbxContent>
+                          <w:p>
+                            <w:pPr>
+                              <w:jc w:val="center"/>
+                              <w:rPr>
+                                <w:sz w:val="48"/>
+                                <w:szCs w:val="48"/>
+                                <w:lang w:bidi="ar-EG"/>
+                              </w:rPr>
+                            </w:pPr>
+                            <w:r>
+                              <w:rPr>
+                                <w:sz w:val="48"/>
+                                <w:szCs w:val="48"/>
+                                <w:lang w:bidi="ar-EG"/>
+                              </w:rPr>
+                              <w:t>cm</w:t>
+                            </w:r>
+                          </w:p>
+                        </w:txbxContent>
+                      </wps:txbx>
+                      <wps:bodyPr rot="0" spcFirstLastPara="0" vertOverflow="overflow" horzOverflow="overflow" vert="horz" wrap="square" lIns="91440" tIns="45720" rIns="91440" bIns="45720" numCol="1" spcCol="0" rtlCol="0" fromWordArt="0" anchor="ctr" anchorCtr="0" forceAA="0" compatLnSpc="1">
+                        <a:prstTxWarp prst="textNoShape">
+                          <a:avLst/>
+                        </a:prstTxWarp>
+                        <a:noAutofit/>
+                      </wps:bodyPr>
+                    </wps:wsp>
+                  </a:graphicData>
+                </a:graphic>
+              </wp:anchor>
+            </w:drawing>
+          </mc:Choice>
+          <mc:Fallback>
+            <w:pict>
+              <v:roundrect w14:anchorId="793AB217" id="_x0000_s1027" style="position:absolute;margin-left:345.75pt;margin-top:4.7pt;width:110.25pt;height:39pt;z-index:251663872;visibility:visible;mso-wrap-style:square;mso-wrap-distance-left:9pt;mso-wrap-distance-top:0;mso-wrap-distance-right:9pt;mso-wrap-distance-bottom:0;mso-position-horizontal:absolute;mso-position-horizontal-relative:text;mso-position-vertical:absolute;mso-position-vertical-relative:text;v-text-anchor:middle" arcsize="10923f" o:gfxdata="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" fillcolor="#4f81bd [3204]" strokecolor="#0a121c [484]" strokeweight="2pt">
+                <v:textbox>
+                  <w:txbxContent>
+                    <w:p>
+                      <w:pPr>
+                        <w:jc w:val="center"/>
+                        <w:rPr>
+                          <w:sz w:val="48"/>
+                          <w:szCs w:val="48"/>
+                          <w:lang w:bidi="ar-EG"/>
+                        </w:rPr>
+                      </w:pPr>
+                      <w:r>
+                        <w:rPr>
+                          <w:sz w:val="48"/>
+                          <w:szCs w:val="48"/>
+                          <w:lang w:bidi="ar-EG"/>
+                        </w:rPr>
+                        <w:t>cm</w:t>
+                      </w:r>
+                    </w:p>
+                  </w:txbxContent>
+                </v:textbox>
+              </v:roundrect>
+            </w:pict>
+          </mc:Fallback>
+        </mc:AlternateContent>
+      </w:r>
+      <w:r>
+        <w:rPr>
           <w:b/>
           <w:bCs/>
           <w:sz w:val="52"/>
           <w:szCs w:val="52"/>
           <w:u w:val="single"/>
         </w:rPr>
-        <w:t xml:space="preserve">Question </w:t>
+        <w:t>Question B</w:t>
       </w:r>
       <w:r>
         <w:rPr>
@@ -714,31 +1010,12 @@
           <w:bCs/>
           <w:sz w:val="52"/>
           <w:szCs w:val="52"/>
-          <w:u w:val="single"/>
-        </w:rPr>
-        <w:t>B</w:t>
-      </w:r>
-      <w:r>
-        <w:rPr>
-          <w:b/>
-          <w:bCs/>
-          <w:sz w:val="52"/>
-          <w:szCs w:val="52"/>
         </w:rPr>
         <w:t xml:space="preserve">: </w:t>
-      </w:r>
-      <w:r>
-        <w:rPr>
-          <w:bCs/>
-          <w:sz w:val="52"/>
-          <w:szCs w:val="52"/>
-        </w:rPr>
-        <w:t>Fill in the blanks.</w:t>
       </w:r>
     </w:p>
     <w:p>
       <w:pPr>
-        <w:jc w:val="right"/>
         <w:rPr>
           <w:bCs/>
           <w:sz w:val="52"/>
@@ -786,13 +1063,13 @@
         <mc:AlternateContent>
           <mc:Choice Requires="wps">
             <w:drawing>
-              <wp:anchor distT="45720" distB="45720" distL="114300" distR="114300" simplePos="0" relativeHeight="251659264" behindDoc="0" locked="0" layoutInCell="1" allowOverlap="1" wp14:anchorId="5EDBF98B" wp14:editId="5DAC8566">
+              <wp:anchor distT="45720" distB="45720" distL="114300" distR="114300" simplePos="0" relativeHeight="251657728" behindDoc="0" locked="0" layoutInCell="1" allowOverlap="1" wp14:anchorId="5EDBF98B" wp14:editId="3B4FF22F">
                 <wp:simplePos x="0" y="0"/>
                 <wp:positionH relativeFrom="column">
-                  <wp:posOffset>2045970</wp:posOffset>
+                  <wp:posOffset>2160270</wp:posOffset>
                 </wp:positionH>
                 <wp:positionV relativeFrom="paragraph">
-                  <wp:posOffset>426720</wp:posOffset>
+                  <wp:posOffset>137160</wp:posOffset>
                 </wp:positionV>
                 <wp:extent cx="2743200" cy="1404620"/>
                 <wp:effectExtent l="0" t="0" r="19050" b="10795"/>
@@ -874,7 +1151,7 @@
                 <v:stroke joinstyle="miter"/>
                 <v:path gradientshapeok="t" o:connecttype="rect"/>
               </v:shapetype>
-              <v:shape id="Text Box 2" o:spid="_x0000_s1026" type="#_x0000_t202" style="position:absolute;left:0;text-align:left;margin-left:161.1pt;margin-top:33.6pt;width:3in;height:110.6pt;z-index:251659264;visibility:visible;mso-wrap-style:square;mso-width-percent:0;mso-height-percent:200;mso-wrap-distance-left:9pt;mso-wrap-distance-top:3.6pt;mso-wrap-distance-right:9pt;mso-wrap-distance-bottom:3.6pt;mso-position-horizontal:absolute;mso-position-horizontal-relative:text;mso-position-vertical:absolute;mso-position-vertical-relative:text;mso-width-percent:0;mso-height-percent:200;mso-width-relative:margin;mso-height-relative:margin;v-text-anchor:top" o:gfxdata="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">
+              <v:shape id="Text Box 2" o:spid="_x0000_s1028" type="#_x0000_t202" style="position:absolute;left:0;text-align:left;margin-left:170.1pt;margin-top:10.8pt;width:3in;height:110.6pt;z-index:251657728;visibility:visible;mso-wrap-style:square;mso-width-percent:0;mso-height-percent:200;mso-wrap-distance-left:9pt;mso-wrap-distance-top:3.6pt;mso-wrap-distance-right:9pt;mso-wrap-distance-bottom:3.6pt;mso-position-horizontal:absolute;mso-position-horizontal-relative:text;mso-position-vertical:absolute;mso-position-vertical-relative:text;mso-width-percent:0;mso-height-percent:200;mso-width-relative:margin;mso-height-relative:margin;v-text-anchor:top" o:gfxdata="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">
                 <v:textbox style="mso-fit-shape-to-text:t">
                   <w:txbxContent>
                     <w:p>
@@ -966,7 +1243,7 @@
 <w:hdr xmlns:wpc="http://schemas.microsoft.com/office/word/2010/wordprocessingCanvas" xmlns:cx="http://schemas.microsoft.com/office/drawing/2014/chartex" xmlns:cx1="http://schemas.microsoft.com/office/drawing/2015/9/8/chartex" xmlns:cx2="http://schemas.microsoft.com/office/drawing/2015/10/21/chartex" xmlns:cx3="http://schemas.microsoft.com/office/drawing/2016/5/9/chartex" xmlns:cx4="http://schemas.microsoft.com/office/drawing/2016/5/10/chartex" xmlns:cx5="http://schemas.microsoft.com/office/drawing/2016/5/11/chartex" xmlns:cx6="http://schemas.microsoft.com/office/drawing/2016/5/12/chartex" xmlns:cx7="http://schemas.microsoft.com/office/drawing/2016/5/13/chartex" xmlns:cx8="http://schemas.microsoft.com/office/drawing/2016/5/14/chartex" xmlns:mc="http://schemas.openxmlformats.org/markup-compatibility/2006" xmlns:aink="http://schemas.microsoft.com/office/drawing/2016/ink" xmlns:am3d="http://schemas.microsoft.com/office/drawing/2017/model3d" xmlns:o="urn:schemas-microsoft-com:office:office" xmlns:oel="http://schemas.microsoft.com/office/2019/extlst" xmlns:r="http://schemas.openxmlformats.org/officeDocument/2006/relationships" xmlns:m="http://schemas.openxmlformats.org/officeDocument/2006/math" xmlns:v="urn:schemas-microsoft-com:vml" xmlns:wp14="http://schemas.microsoft.com/office/word/2010/wordprocessingDrawing" xmlns:wp="http://schemas.openxmlformats.org/drawingml/2006/wordprocessingDrawing" xmlns:w10="urn:schemas-microsoft-com:office:word" xmlns:w="http://schemas.openxmlformats.org/wordprocessingml/2006/main" xmlns:w14="http://schemas.microsoft.com/office/word/2010/wordml" xmlns:w15="http://schemas.microsoft.com/office/word/2012/wordml" xmlns:w16cex="http://schemas.microsoft.com/office/word/2018/wordml/cex" xmlns:w16cid="http://schemas.microsoft.com/office/word/2016/wordml/cid" xmlns:w16="http://schemas.microsoft.com/office/word/2018/wordml" xmlns:w16du="http://schemas.microsoft.com/office/word/2023/wordml/word16du" xmlns:w16sdtdh="http://schemas.microsoft.com/office/word/2020/wordml/sdtdatahash" xmlns:w16sdtfl="http://schemas.microsoft.com/office/word/2024/wordml/sdtformatlock" xmlns:w16se="http://schemas.microsoft.com/office/word/2015/wordml/symex" xmlns:wpg="http://schemas.microsoft.com/office/word/2010/wordprocessingGroup" xmlns:wpi="http://schemas.microsoft.com/office/word/2010/wordprocessingInk" xmlns:wne="http://schemas.microsoft.com/office/word/2006/wordml" xmlns:wps="http://schemas.microsoft.com/office/word/2010/wordprocessingShape" mc:Ignorable="w14 w15 w16se w16cid w16 w16cex w16sdtdh w16sdtfl w16du wp14">
   <w:p>
     <w:pPr>
-      <w:pStyle w:val="Header"/>
+      <w:pStyle w:val="a4"/>
     </w:pPr>
     <w:r>
       <w:rPr>
@@ -1879,7 +2156,7 @@
     <w:lsdException w:name="Unresolved Mention" w:semiHidden="1" w:unhideWhenUsed="1"/>
     <w:lsdException w:name="Smart Link" w:semiHidden="1" w:unhideWhenUsed="1"/>
   </w:latentStyles>
-  <w:style w:type="paragraph" w:default="1" w:styleId="Normal">
+  <w:style w:type="paragraph" w:default="1" w:styleId="a">
     <w:name w:val="Normal"/>
     <w:qFormat/>
     <w:rsid w:val="003D0CC3"/>
@@ -1893,13 +2170,13 @@
       <w:szCs w:val="24"/>
     </w:rPr>
   </w:style>
-  <w:style w:type="character" w:default="1" w:styleId="DefaultParagraphFont">
+  <w:style w:type="character" w:default="1" w:styleId="a0">
     <w:name w:val="Default Paragraph Font"/>
     <w:uiPriority w:val="1"/>
     <w:semiHidden/>
     <w:unhideWhenUsed/>
   </w:style>
-  <w:style w:type="table" w:default="1" w:styleId="TableNormal">
+  <w:style w:type="table" w:default="1" w:styleId="a1">
     <w:name w:val="Normal Table"/>
     <w:uiPriority w:val="99"/>
     <w:semiHidden/>
@@ -1914,16 +2191,16 @@
       </w:tblCellMar>
     </w:tblPr>
   </w:style>
-  <w:style w:type="numbering" w:default="1" w:styleId="NoList">
+  <w:style w:type="numbering" w:default="1" w:styleId="a2">
     <w:name w:val="No List"/>
     <w:uiPriority w:val="99"/>
     <w:semiHidden/>
     <w:unhideWhenUsed/>
   </w:style>
-  <w:style w:type="paragraph" w:styleId="BalloonText">
+  <w:style w:type="paragraph" w:styleId="a3">
     <w:name w:val="Balloon Text"/>
-    <w:basedOn w:val="Normal"/>
-    <w:link w:val="BalloonTextChar"/>
+    <w:basedOn w:val="a"/>
+    <w:link w:val="Char"/>
     <w:uiPriority w:val="99"/>
     <w:semiHidden/>
     <w:unhideWhenUsed/>
@@ -1937,10 +2214,10 @@
       <w:szCs w:val="16"/>
     </w:rPr>
   </w:style>
-  <w:style w:type="character" w:customStyle="1" w:styleId="BalloonTextChar">
-    <w:name w:val="Balloon Text Char"/>
-    <w:basedOn w:val="DefaultParagraphFont"/>
-    <w:link w:val="BalloonText"/>
+  <w:style w:type="character" w:customStyle="1" w:styleId="Char">
+    <w:name w:val="نص في بالون Char"/>
+    <w:basedOn w:val="a0"/>
+    <w:link w:val="a3"/>
     <w:uiPriority w:val="99"/>
     <w:semiHidden/>
     <w:rsid w:val="003D0CC3"/>
@@ -1950,10 +2227,10 @@
       <w:szCs w:val="16"/>
     </w:rPr>
   </w:style>
-  <w:style w:type="paragraph" w:styleId="Header">
+  <w:style w:type="paragraph" w:styleId="a4">
     <w:name w:val="header"/>
-    <w:basedOn w:val="Normal"/>
-    <w:link w:val="HeaderChar"/>
+    <w:basedOn w:val="a"/>
+    <w:link w:val="Char0"/>
     <w:uiPriority w:val="99"/>
     <w:unhideWhenUsed/>
     <w:rsid w:val="003D0CC3"/>
@@ -1970,17 +2247,17 @@
       <w:szCs w:val="22"/>
     </w:rPr>
   </w:style>
-  <w:style w:type="character" w:customStyle="1" w:styleId="HeaderChar">
-    <w:name w:val="Header Char"/>
-    <w:basedOn w:val="DefaultParagraphFont"/>
-    <w:link w:val="Header"/>
+  <w:style w:type="character" w:customStyle="1" w:styleId="Char0">
+    <w:name w:val="رأس الصفحة Char"/>
+    <w:basedOn w:val="a0"/>
+    <w:link w:val="a4"/>
     <w:uiPriority w:val="99"/>
     <w:rsid w:val="003D0CC3"/>
   </w:style>
-  <w:style w:type="paragraph" w:styleId="Footer">
+  <w:style w:type="paragraph" w:styleId="a5">
     <w:name w:val="footer"/>
-    <w:basedOn w:val="Normal"/>
-    <w:link w:val="FooterChar"/>
+    <w:basedOn w:val="a"/>
+    <w:link w:val="Char1"/>
     <w:uiPriority w:val="99"/>
     <w:unhideWhenUsed/>
     <w:rsid w:val="003D0CC3"/>
@@ -1997,16 +2274,16 @@
       <w:szCs w:val="22"/>
     </w:rPr>
   </w:style>
-  <w:style w:type="character" w:customStyle="1" w:styleId="FooterChar">
-    <w:name w:val="Footer Char"/>
-    <w:basedOn w:val="DefaultParagraphFont"/>
-    <w:link w:val="Footer"/>
+  <w:style w:type="character" w:customStyle="1" w:styleId="Char1">
+    <w:name w:val="تذييل الصفحة Char"/>
+    <w:basedOn w:val="a0"/>
+    <w:link w:val="a5"/>
     <w:uiPriority w:val="99"/>
     <w:rsid w:val="003D0CC3"/>
   </w:style>
-  <w:style w:type="table" w:styleId="TableGrid">
+  <w:style w:type="table" w:styleId="a6">
     <w:name w:val="Table Grid"/>
-    <w:basedOn w:val="TableNormal"/>
+    <w:basedOn w:val="a1"/>
     <w:uiPriority w:val="59"/>
     <w:rsid w:val="00AB3A99"/>
     <w:pPr>
@@ -2026,9 +2303,9 @@
       </w:tblBorders>
     </w:tblPr>
   </w:style>
-  <w:style w:type="paragraph" w:styleId="ListParagraph">
+  <w:style w:type="paragraph" w:styleId="a7">
     <w:name w:val="List Paragraph"/>
-    <w:basedOn w:val="Normal"/>
+    <w:basedOn w:val="a"/>
     <w:uiPriority w:val="34"/>
     <w:qFormat/>
     <w:rsid w:val="0094183E"/>

</xml_diff>